<commit_message>
h1 as Title, house default reference, legal numbering features
Markdown h1 maps to Word's unnumbered Title style; h2-h6 map to Heading1-5, so number_headings schemes bind from h2. The bundled reference gains the house look: TNR 11, 1.5 spacing, justified prose, stair-stepped heading numbers, Centered style, page-number footer (tools/createref.py applies it, with a no-seed restyle path). Also adds numbered_lists='legal' (every ol shares one multilevel instance) and makes li and span ids REF targets.
</commit_message>
<xml_diff>
--- a/mdhtml2docx/templates/reference.docx
+++ b/mdhtml2docx/templates/reference.docx
@@ -4,6 +4,7 @@
   <w:body>
     <w:p/>
     <w:sectPr>
+      <w:footerReference w:type="default" r:id="rId6"/>
       <w:pgSz w:w="12240" w:h="15840"/>
       <w:pgMar w:top="1440" w:right="1440" w:bottom="1440" w:left="1440" w:header="720" w:footer="720" w:gutter="0"/>
       <w:cols w:space="720"/>
@@ -13,17 +14,30 @@
 </w:document>
 </file>
 
+<file path=word/footer1.xml><?xml version="1.0" encoding="utf-8"?>
+<w:ftr xmlns:w="http://schemas.openxmlformats.org/wordprocessingml/2006/main">
+  <w:p>
+    <w:pPr>
+      <w:jc w:val="center"/>
+    </w:pPr>
+    <w:fldSimple w:instr=" PAGE ">
+      <w:r>
+        <w:t>1</w:t>
+      </w:r>
+    </w:fldSimple>
+  </w:p>
+</w:ftr>
+</file>
+
 <file path=word/styles.xml><?xml version="1.0" encoding="utf-8"?>
 <w:styles xmlns:mc="http://schemas.openxmlformats.org/markup-compatibility/2006" xmlns:r="http://schemas.openxmlformats.org/officeDocument/2006/relationships" xmlns:w="http://schemas.openxmlformats.org/wordprocessingml/2006/main" xmlns:w14="http://schemas.microsoft.com/office/word/2010/wordml" xmlns:w15="http://schemas.microsoft.com/office/word/2012/wordml" xmlns:w16cex="http://schemas.microsoft.com/office/word/2018/wordml/cex" xmlns:w16cid="http://schemas.microsoft.com/office/word/2016/wordml/cid" xmlns:w16="http://schemas.microsoft.com/office/word/2018/wordml" xmlns:w16sdtdh="http://schemas.microsoft.com/office/word/2020/wordml/sdtdatahash" xmlns:w16sdtfl="http://schemas.microsoft.com/office/word/2024/wordml/sdtformatlock" xmlns:w16se="http://schemas.microsoft.com/office/word/2015/wordml/symex" xmlns:w16du="http://schemas.microsoft.com/office/word/2023/wordml/word16du" mc:Ignorable="w14 w15 w16se w16cid w16 w16cex w16sdtdh w16sdtfl w16du">
   <w:docDefaults>
     <w:rPrDefault>
       <w:rPr>
-        <w:rFonts w:asciiTheme="minorHAnsi" w:eastAsiaTheme="minorEastAsia" w:hAnsiTheme="minorHAnsi" w:cstheme="minorBidi"/>
-        <w:kern w:val="2"/>
-        <w:sz w:val="24"/>
-        <w:szCs w:val="24"/>
-        <w:lang w:val="en-US" w:eastAsia="zh-CN" w:bidi="ar-SA"/>
-        <w14:ligatures w14:val="standardContextual"/>
+        <w:rFonts w:ascii="Times New Roman" w:hAnsi="Times New Roman" w:eastAsia="Times New Roman" w:cs="Times New Roman"/>
+        <w:sz w:val="22"/>
+        <w:szCs w:val="22"/>
+        <w:lang w:val="en-US"/>
       </w:rPr>
     </w:rPrDefault>
     <w:pPrDefault>
@@ -413,6 +427,11 @@
   <w:style w:type="paragraph" w:default="1" w:styleId="Normal">
     <w:name w:val="Normal"/>
     <w:qFormat/>
+    <w:pPr>
+      <w:spacing w:line="360" w:lineRule="auto" w:after="220"/>
+      <w:ind w:firstLine="0"/>
+      <w:jc w:val="both"/>
+    </w:pPr>
   </w:style>
   <w:style w:type="paragraph" w:styleId="Heading1">
     <w:name w:val="heading 1"/>
@@ -423,16 +442,16 @@
     <w:qFormat/>
     <w:rsid w:val="00F81AA1"/>
     <w:pPr>
-      <w:keepNext/>
-      <w:keepLines/>
-      <w:spacing w:before="360" w:after="80"/>
+      <w:spacing w:line="360" w:lineRule="auto" w:after="220"/>
+      <w:jc w:val="both"/>
       <w:outlineLvl w:val="0"/>
     </w:pPr>
     <w:rPr>
-      <w:rFonts w:asciiTheme="majorHAnsi" w:eastAsiaTheme="majorEastAsia" w:hAnsiTheme="majorHAnsi" w:cstheme="majorBidi"/>
-      <w:color w:val="0F4761" w:themeColor="accent1" w:themeShade="BF"/>
-      <w:sz w:val="40"/>
-      <w:szCs w:val="40"/>
+      <w:rFonts w:ascii="Times New Roman" w:hAnsi="Times New Roman" w:eastAsia="Times New Roman" w:cs="Times New Roman"/>
+      <w:b/>
+      <w:color w:val="auto"/>
+      <w:sz w:val="22"/>
+      <w:szCs w:val="22"/>
     </w:rPr>
   </w:style>
   <w:style w:type="paragraph" w:styleId="Heading2">
@@ -446,16 +465,16 @@
     <w:qFormat/>
     <w:rsid w:val="00F81AA1"/>
     <w:pPr>
-      <w:keepNext/>
-      <w:keepLines/>
-      <w:spacing w:before="160" w:after="80"/>
+      <w:spacing w:line="360" w:lineRule="auto" w:after="220"/>
+      <w:jc w:val="both"/>
       <w:outlineLvl w:val="1"/>
     </w:pPr>
     <w:rPr>
-      <w:rFonts w:asciiTheme="majorHAnsi" w:eastAsiaTheme="majorEastAsia" w:hAnsiTheme="majorHAnsi" w:cstheme="majorBidi"/>
-      <w:color w:val="0F4761" w:themeColor="accent1" w:themeShade="BF"/>
-      <w:sz w:val="32"/>
-      <w:szCs w:val="32"/>
+      <w:rFonts w:ascii="Times New Roman" w:hAnsi="Times New Roman" w:eastAsia="Times New Roman" w:cs="Times New Roman"/>
+      <w:b/>
+      <w:color w:val="auto"/>
+      <w:sz w:val="22"/>
+      <w:szCs w:val="22"/>
     </w:rPr>
   </w:style>
   <w:style w:type="paragraph" w:styleId="Heading3">
@@ -469,16 +488,16 @@
     <w:qFormat/>
     <w:rsid w:val="00F81AA1"/>
     <w:pPr>
-      <w:keepNext/>
-      <w:keepLines/>
-      <w:spacing w:before="160" w:after="80"/>
+      <w:spacing w:line="360" w:lineRule="auto" w:after="220"/>
+      <w:jc w:val="both"/>
       <w:outlineLvl w:val="2"/>
     </w:pPr>
     <w:rPr>
-      <w:rFonts w:eastAsiaTheme="majorEastAsia" w:cstheme="majorBidi"/>
-      <w:color w:val="0F4761" w:themeColor="accent1" w:themeShade="BF"/>
-      <w:sz w:val="28"/>
-      <w:szCs w:val="28"/>
+      <w:rFonts w:ascii="Times New Roman" w:hAnsi="Times New Roman" w:eastAsia="Times New Roman" w:cs="Times New Roman"/>
+      <w:b/>
+      <w:color w:val="auto"/>
+      <w:sz w:val="22"/>
+      <w:szCs w:val="22"/>
     </w:rPr>
   </w:style>
   <w:style w:type="paragraph" w:styleId="Heading4">
@@ -492,16 +511,16 @@
     <w:qFormat/>
     <w:rsid w:val="00F81AA1"/>
     <w:pPr>
-      <w:keepNext/>
-      <w:keepLines/>
-      <w:spacing w:before="80" w:after="40"/>
+      <w:spacing w:line="360" w:lineRule="auto" w:after="220"/>
+      <w:jc w:val="both"/>
       <w:outlineLvl w:val="3"/>
     </w:pPr>
     <w:rPr>
-      <w:rFonts w:eastAsiaTheme="majorEastAsia" w:cstheme="majorBidi"/>
-      <w:i/>
-      <w:iCs/>
-      <w:color w:val="0F4761" w:themeColor="accent1" w:themeShade="BF"/>
+      <w:rFonts w:ascii="Times New Roman" w:hAnsi="Times New Roman" w:eastAsia="Times New Roman" w:cs="Times New Roman"/>
+      <w:b/>
+      <w:color w:val="auto"/>
+      <w:sz w:val="22"/>
+      <w:szCs w:val="22"/>
     </w:rPr>
   </w:style>
   <w:style w:type="paragraph" w:styleId="Heading5">
@@ -515,14 +534,16 @@
     <w:qFormat/>
     <w:rsid w:val="00F81AA1"/>
     <w:pPr>
-      <w:keepNext/>
-      <w:keepLines/>
-      <w:spacing w:before="80" w:after="40"/>
+      <w:spacing w:line="360" w:lineRule="auto" w:after="220"/>
+      <w:jc w:val="both"/>
       <w:outlineLvl w:val="4"/>
     </w:pPr>
     <w:rPr>
-      <w:rFonts w:eastAsiaTheme="majorEastAsia" w:cstheme="majorBidi"/>
-      <w:color w:val="0F4761" w:themeColor="accent1" w:themeShade="BF"/>
+      <w:rFonts w:ascii="Times New Roman" w:hAnsi="Times New Roman" w:eastAsia="Times New Roman" w:cs="Times New Roman"/>
+      <w:b/>
+      <w:color w:val="auto"/>
+      <w:sz w:val="22"/>
+      <w:szCs w:val="22"/>
     </w:rPr>
   </w:style>
   <w:style w:type="paragraph" w:styleId="Heading6">
@@ -536,16 +557,16 @@
     <w:qFormat/>
     <w:rsid w:val="00F81AA1"/>
     <w:pPr>
-      <w:keepNext/>
-      <w:keepLines/>
-      <w:spacing w:before="40" w:after="0"/>
+      <w:spacing w:line="360" w:lineRule="auto" w:after="220"/>
+      <w:jc w:val="both"/>
       <w:outlineLvl w:val="5"/>
     </w:pPr>
     <w:rPr>
-      <w:rFonts w:eastAsiaTheme="majorEastAsia" w:cstheme="majorBidi"/>
-      <w:i/>
-      <w:iCs/>
-      <w:color w:val="595959" w:themeColor="text1" w:themeTint="A6"/>
+      <w:rFonts w:ascii="Times New Roman" w:hAnsi="Times New Roman" w:eastAsia="Times New Roman" w:cs="Times New Roman"/>
+      <w:b/>
+      <w:color w:val="auto"/>
+      <w:sz w:val="22"/>
+      <w:szCs w:val="22"/>
     </w:rPr>
   </w:style>
   <w:style w:type="character" w:default="1" w:styleId="DefaultParagraphFont">
@@ -847,6 +868,30 @@
     <w:uiPriority w:val="40"/>
     <w:pPr>
       <w:spacing w:after="0" w:line="240" w:lineRule="auto"/>
+    </w:pPr>
+  </w:style>
+  <w:style w:type="paragraph" w:styleId="Title">
+    <w:name w:val="Title"/>
+    <w:basedOn w:val="Normal"/>
+    <w:next w:val="FirstParagraph"/>
+    <w:uiPriority w:val="10"/>
+    <w:qFormat/>
+    <w:pPr>
+      <w:jc w:val="center"/>
+    </w:pPr>
+    <w:rPr>
+      <w:sz w:val="28"/>
+      <w:szCs w:val="28"/>
+    </w:rPr>
+  </w:style>
+  <w:style w:type="paragraph" w:customStyle="1" w:styleId="Centered">
+    <w:name w:val="Centered"/>
+    <w:basedOn w:val="BodyText"/>
+    <w:next w:val="BodyText"/>
+    <w:qFormat/>
+    <w:pPr>
+      <w:ind w:firstLine="0"/>
+      <w:jc w:val="center"/>
     </w:pPr>
   </w:style>
 </w:styles>

</xml_diff>

<commit_message>
h1 as Title, house default reference, span REF targets
Markdown h1 maps to Word's unnumbered Title style; h2-h6 map to Heading1-5, so number_headings schemes bind from h2, with numbers flush at the margin and heading text stair-stepping 0.25" per level. The bundled reference gains the house look: TNR 11, 1.5 spacing, justified prose, Centered style, page-number footer (tools/createref.py applies it, with a no-seed restyle path). Span ids become REF targets, so a span inside a title gives short cross-reference text.

Split from title-and-house-reference, leaving the numbered_lists feature and li REF targets behind: this branch is what the fasttract template-headings branch depends on.
</commit_message>
<xml_diff>
--- a/mdhtml2docx/templates/reference.docx
+++ b/mdhtml2docx/templates/reference.docx
@@ -4,6 +4,7 @@
   <w:body>
     <w:p/>
     <w:sectPr>
+      <w:footerReference w:type="default" r:id="rId6"/>
       <w:pgSz w:w="12240" w:h="15840"/>
       <w:pgMar w:top="1440" w:right="1440" w:bottom="1440" w:left="1440" w:header="720" w:footer="720" w:gutter="0"/>
       <w:cols w:space="720"/>
@@ -13,17 +14,30 @@
 </w:document>
 </file>
 
+<file path=word/footer1.xml><?xml version="1.0" encoding="utf-8"?>
+<w:ftr xmlns:w="http://schemas.openxmlformats.org/wordprocessingml/2006/main">
+  <w:p>
+    <w:pPr>
+      <w:jc w:val="center"/>
+    </w:pPr>
+    <w:fldSimple w:instr=" PAGE ">
+      <w:r>
+        <w:t>1</w:t>
+      </w:r>
+    </w:fldSimple>
+  </w:p>
+</w:ftr>
+</file>
+
 <file path=word/styles.xml><?xml version="1.0" encoding="utf-8"?>
 <w:styles xmlns:mc="http://schemas.openxmlformats.org/markup-compatibility/2006" xmlns:r="http://schemas.openxmlformats.org/officeDocument/2006/relationships" xmlns:w="http://schemas.openxmlformats.org/wordprocessingml/2006/main" xmlns:w14="http://schemas.microsoft.com/office/word/2010/wordml" xmlns:w15="http://schemas.microsoft.com/office/word/2012/wordml" xmlns:w16cex="http://schemas.microsoft.com/office/word/2018/wordml/cex" xmlns:w16cid="http://schemas.microsoft.com/office/word/2016/wordml/cid" xmlns:w16="http://schemas.microsoft.com/office/word/2018/wordml" xmlns:w16sdtdh="http://schemas.microsoft.com/office/word/2020/wordml/sdtdatahash" xmlns:w16sdtfl="http://schemas.microsoft.com/office/word/2024/wordml/sdtformatlock" xmlns:w16se="http://schemas.microsoft.com/office/word/2015/wordml/symex" xmlns:w16du="http://schemas.microsoft.com/office/word/2023/wordml/word16du" mc:Ignorable="w14 w15 w16se w16cid w16 w16cex w16sdtdh w16sdtfl w16du">
   <w:docDefaults>
     <w:rPrDefault>
       <w:rPr>
-        <w:rFonts w:asciiTheme="minorHAnsi" w:eastAsiaTheme="minorEastAsia" w:hAnsiTheme="minorHAnsi" w:cstheme="minorBidi"/>
-        <w:kern w:val="2"/>
-        <w:sz w:val="24"/>
-        <w:szCs w:val="24"/>
-        <w:lang w:val="en-US" w:eastAsia="zh-CN" w:bidi="ar-SA"/>
-        <w14:ligatures w14:val="standardContextual"/>
+        <w:rFonts w:ascii="Times New Roman" w:hAnsi="Times New Roman" w:eastAsia="Times New Roman" w:cs="Times New Roman"/>
+        <w:sz w:val="22"/>
+        <w:szCs w:val="22"/>
+        <w:lang w:val="en-US"/>
       </w:rPr>
     </w:rPrDefault>
     <w:pPrDefault>
@@ -413,6 +427,11 @@
   <w:style w:type="paragraph" w:default="1" w:styleId="Normal">
     <w:name w:val="Normal"/>
     <w:qFormat/>
+    <w:pPr>
+      <w:spacing w:line="360" w:lineRule="auto" w:after="220"/>
+      <w:ind w:firstLine="0"/>
+      <w:jc w:val="both"/>
+    </w:pPr>
   </w:style>
   <w:style w:type="paragraph" w:styleId="Heading1">
     <w:name w:val="heading 1"/>
@@ -423,16 +442,16 @@
     <w:qFormat/>
     <w:rsid w:val="00F81AA1"/>
     <w:pPr>
-      <w:keepNext/>
-      <w:keepLines/>
-      <w:spacing w:before="360" w:after="80"/>
+      <w:spacing w:line="360" w:lineRule="auto" w:after="220"/>
+      <w:jc w:val="both"/>
       <w:outlineLvl w:val="0"/>
     </w:pPr>
     <w:rPr>
-      <w:rFonts w:asciiTheme="majorHAnsi" w:eastAsiaTheme="majorEastAsia" w:hAnsiTheme="majorHAnsi" w:cstheme="majorBidi"/>
-      <w:color w:val="0F4761" w:themeColor="accent1" w:themeShade="BF"/>
-      <w:sz w:val="40"/>
-      <w:szCs w:val="40"/>
+      <w:rFonts w:ascii="Times New Roman" w:hAnsi="Times New Roman" w:eastAsia="Times New Roman" w:cs="Times New Roman"/>
+      <w:b/>
+      <w:color w:val="auto"/>
+      <w:sz w:val="22"/>
+      <w:szCs w:val="22"/>
     </w:rPr>
   </w:style>
   <w:style w:type="paragraph" w:styleId="Heading2">
@@ -446,16 +465,16 @@
     <w:qFormat/>
     <w:rsid w:val="00F81AA1"/>
     <w:pPr>
-      <w:keepNext/>
-      <w:keepLines/>
-      <w:spacing w:before="160" w:after="80"/>
+      <w:spacing w:line="360" w:lineRule="auto" w:after="220"/>
+      <w:jc w:val="both"/>
       <w:outlineLvl w:val="1"/>
     </w:pPr>
     <w:rPr>
-      <w:rFonts w:asciiTheme="majorHAnsi" w:eastAsiaTheme="majorEastAsia" w:hAnsiTheme="majorHAnsi" w:cstheme="majorBidi"/>
-      <w:color w:val="0F4761" w:themeColor="accent1" w:themeShade="BF"/>
-      <w:sz w:val="32"/>
-      <w:szCs w:val="32"/>
+      <w:rFonts w:ascii="Times New Roman" w:hAnsi="Times New Roman" w:eastAsia="Times New Roman" w:cs="Times New Roman"/>
+      <w:b/>
+      <w:color w:val="auto"/>
+      <w:sz w:val="22"/>
+      <w:szCs w:val="22"/>
     </w:rPr>
   </w:style>
   <w:style w:type="paragraph" w:styleId="Heading3">
@@ -469,16 +488,16 @@
     <w:qFormat/>
     <w:rsid w:val="00F81AA1"/>
     <w:pPr>
-      <w:keepNext/>
-      <w:keepLines/>
-      <w:spacing w:before="160" w:after="80"/>
+      <w:spacing w:line="360" w:lineRule="auto" w:after="220"/>
+      <w:jc w:val="both"/>
       <w:outlineLvl w:val="2"/>
     </w:pPr>
     <w:rPr>
-      <w:rFonts w:eastAsiaTheme="majorEastAsia" w:cstheme="majorBidi"/>
-      <w:color w:val="0F4761" w:themeColor="accent1" w:themeShade="BF"/>
-      <w:sz w:val="28"/>
-      <w:szCs w:val="28"/>
+      <w:rFonts w:ascii="Times New Roman" w:hAnsi="Times New Roman" w:eastAsia="Times New Roman" w:cs="Times New Roman"/>
+      <w:b/>
+      <w:color w:val="auto"/>
+      <w:sz w:val="22"/>
+      <w:szCs w:val="22"/>
     </w:rPr>
   </w:style>
   <w:style w:type="paragraph" w:styleId="Heading4">
@@ -492,16 +511,16 @@
     <w:qFormat/>
     <w:rsid w:val="00F81AA1"/>
     <w:pPr>
-      <w:keepNext/>
-      <w:keepLines/>
-      <w:spacing w:before="80" w:after="40"/>
+      <w:spacing w:line="360" w:lineRule="auto" w:after="220"/>
+      <w:jc w:val="both"/>
       <w:outlineLvl w:val="3"/>
     </w:pPr>
     <w:rPr>
-      <w:rFonts w:eastAsiaTheme="majorEastAsia" w:cstheme="majorBidi"/>
-      <w:i/>
-      <w:iCs/>
-      <w:color w:val="0F4761" w:themeColor="accent1" w:themeShade="BF"/>
+      <w:rFonts w:ascii="Times New Roman" w:hAnsi="Times New Roman" w:eastAsia="Times New Roman" w:cs="Times New Roman"/>
+      <w:b/>
+      <w:color w:val="auto"/>
+      <w:sz w:val="22"/>
+      <w:szCs w:val="22"/>
     </w:rPr>
   </w:style>
   <w:style w:type="paragraph" w:styleId="Heading5">
@@ -515,14 +534,16 @@
     <w:qFormat/>
     <w:rsid w:val="00F81AA1"/>
     <w:pPr>
-      <w:keepNext/>
-      <w:keepLines/>
-      <w:spacing w:before="80" w:after="40"/>
+      <w:spacing w:line="360" w:lineRule="auto" w:after="220"/>
+      <w:jc w:val="both"/>
       <w:outlineLvl w:val="4"/>
     </w:pPr>
     <w:rPr>
-      <w:rFonts w:eastAsiaTheme="majorEastAsia" w:cstheme="majorBidi"/>
-      <w:color w:val="0F4761" w:themeColor="accent1" w:themeShade="BF"/>
+      <w:rFonts w:ascii="Times New Roman" w:hAnsi="Times New Roman" w:eastAsia="Times New Roman" w:cs="Times New Roman"/>
+      <w:b/>
+      <w:color w:val="auto"/>
+      <w:sz w:val="22"/>
+      <w:szCs w:val="22"/>
     </w:rPr>
   </w:style>
   <w:style w:type="paragraph" w:styleId="Heading6">
@@ -536,16 +557,16 @@
     <w:qFormat/>
     <w:rsid w:val="00F81AA1"/>
     <w:pPr>
-      <w:keepNext/>
-      <w:keepLines/>
-      <w:spacing w:before="40" w:after="0"/>
+      <w:spacing w:line="360" w:lineRule="auto" w:after="220"/>
+      <w:jc w:val="both"/>
       <w:outlineLvl w:val="5"/>
     </w:pPr>
     <w:rPr>
-      <w:rFonts w:eastAsiaTheme="majorEastAsia" w:cstheme="majorBidi"/>
-      <w:i/>
-      <w:iCs/>
-      <w:color w:val="595959" w:themeColor="text1" w:themeTint="A6"/>
+      <w:rFonts w:ascii="Times New Roman" w:hAnsi="Times New Roman" w:eastAsia="Times New Roman" w:cs="Times New Roman"/>
+      <w:b/>
+      <w:color w:val="auto"/>
+      <w:sz w:val="22"/>
+      <w:szCs w:val="22"/>
     </w:rPr>
   </w:style>
   <w:style w:type="character" w:default="1" w:styleId="DefaultParagraphFont">
@@ -847,6 +868,30 @@
     <w:uiPriority w:val="40"/>
     <w:pPr>
       <w:spacing w:after="0" w:line="240" w:lineRule="auto"/>
+    </w:pPr>
+  </w:style>
+  <w:style w:type="paragraph" w:styleId="Title">
+    <w:name w:val="Title"/>
+    <w:basedOn w:val="Normal"/>
+    <w:next w:val="FirstParagraph"/>
+    <w:uiPriority w:val="10"/>
+    <w:qFormat/>
+    <w:pPr>
+      <w:jc w:val="center"/>
+    </w:pPr>
+    <w:rPr>
+      <w:sz w:val="28"/>
+      <w:szCs w:val="28"/>
+    </w:rPr>
+  </w:style>
+  <w:style w:type="paragraph" w:customStyle="1" w:styleId="Centered">
+    <w:name w:val="Centered"/>
+    <w:basedOn w:val="BodyText"/>
+    <w:next w:val="BodyText"/>
+    <w:qFormat/>
+    <w:pPr>
+      <w:ind w:firstLine="0"/>
+      <w:jc w:val="center"/>
     </w:pPr>
   </w:style>
 </w:styles>

</xml_diff>

<commit_message>
Build the reference from a committed Word-web seed
The seed (_data/empty.docx) is now in the repo: an empty Word-for-the-web document carrying theme, fonts, settings, empty header/footer slots, and materialized definitions for the kept built-ins (Heading 1-6, Quote, Title, ListParagraph) - the reproduction ritual is documented in the script docstring. Title joins KEEP (restyled to house: centered, 14pt) instead of being authored; the linked Char twins leave KEEP (web Word writes styles unlinked). The house pass folds into build_styles, the footer becomes a content transform of the seed's own footer part (deleting the four-part wiring code and restyle()), sectPr references are reordered to schema position (web Word appends them), and constants are lowercase. verify() now also checks the page-number footer.
</commit_message>
<xml_diff>
--- a/mdhtml2docx/templates/reference.docx
+++ b/mdhtml2docx/templates/reference.docx
@@ -1,11 +1,16 @@
 
 <file path=word/document.xml><?xml version="1.0" encoding="utf-8"?>
-<w:document xmlns:wpc="http://schemas.microsoft.com/office/word/2010/wordprocessingCanvas" xmlns:cx="http://schemas.microsoft.com/office/drawing/2014/chartex" xmlns:cx1="http://schemas.microsoft.com/office/drawing/2015/9/8/chartex" xmlns:cx2="http://schemas.microsoft.com/office/drawing/2015/10/21/chartex" xmlns:cx3="http://schemas.microsoft.com/office/drawing/2016/5/9/chartex" xmlns:cx4="http://schemas.microsoft.com/office/drawing/2016/5/10/chartex" xmlns:cx5="http://schemas.microsoft.com/office/drawing/2016/5/11/chartex" xmlns:cx6="http://schemas.microsoft.com/office/drawing/2016/5/12/chartex" xmlns:cx7="http://schemas.microsoft.com/office/drawing/2016/5/13/chartex" xmlns:cx8="http://schemas.microsoft.com/office/drawing/2016/5/14/chartex" xmlns:mc="http://schemas.openxmlformats.org/markup-compatibility/2006" xmlns:m="http://schemas.openxmlformats.org/officeDocument/2006/math" xmlns:aink="http://schemas.microsoft.com/office/drawing/2016/ink" xmlns:am3d="http://schemas.microsoft.com/office/drawing/2017/model3d" xmlns:oel="http://schemas.microsoft.com/office/2019/extlst" xmlns:r="http://schemas.openxmlformats.org/officeDocument/2006/relationships" xmlns:wp14="http://schemas.microsoft.com/office/word/2010/wordprocessingDrawing" xmlns:wp="http://schemas.openxmlformats.org/drawingml/2006/wordprocessingDrawing" xmlns:wpg="http://schemas.microsoft.com/office/word/2010/wordprocessingGroup" xmlns:wpi="http://schemas.microsoft.com/office/word/2010/wordprocessingInk" xmlns:wps="http://schemas.microsoft.com/office/word/2010/wordprocessingShape" xmlns:o="urn:schemas-microsoft-com:office:office" xmlns:v="urn:schemas-microsoft-com:vml" xmlns:w10="urn:schemas-microsoft-com:office:word" xmlns:w="http://schemas.openxmlformats.org/wordprocessingml/2006/main" xmlns:w14="http://schemas.microsoft.com/office/word/2010/wordml" xmlns:w15="http://schemas.microsoft.com/office/word/2012/wordml" xmlns:w16cei="http://schemas.microsoft.com/office/word/2026/wordml/cei" xmlns:w16cex="http://schemas.microsoft.com/office/word/2018/wordml/cex" xmlns:w16cid="http://schemas.microsoft.com/office/word/2016/wordml/cid" xmlns:w16="http://schemas.microsoft.com/office/word/2018/wordml" xmlns:w16sdtdh="http://schemas.microsoft.com/office/word/2020/wordml/sdtdatahash" xmlns:w16sdtfl="http://schemas.microsoft.com/office/word/2024/wordml/sdtformatlock" xmlns:w16se="http://schemas.microsoft.com/office/word/2015/wordml/symex" xmlns:w16du="http://schemas.microsoft.com/office/word/2023/wordml/word16du" xmlns:wne="http://schemas.microsoft.com/office/word/2006/wordml" mc:Ignorable="w14 w15 w16se w16cid w16 w16cex w16sdtdh w16sdtfl w16du wp14">
+<w:document xmlns:wpc="http://schemas.microsoft.com/office/word/2010/wordprocessingCanvas" xmlns:mc="http://schemas.openxmlformats.org/markup-compatibility/2006" xmlns:o="urn:schemas-microsoft-com:office:office" xmlns:r="http://schemas.openxmlformats.org/officeDocument/2006/relationships" xmlns:m="http://schemas.openxmlformats.org/officeDocument/2006/math" xmlns:v="urn:schemas-microsoft-com:vml" xmlns:wp14="http://schemas.microsoft.com/office/word/2010/wordprocessingDrawing" xmlns:wp="http://schemas.openxmlformats.org/drawingml/2006/wordprocessingDrawing" xmlns:w10="urn:schemas-microsoft-com:office:word" xmlns:w="http://schemas.openxmlformats.org/wordprocessingml/2006/main" xmlns:w14="http://schemas.microsoft.com/office/word/2010/wordml" xmlns:w15="http://schemas.microsoft.com/office/word/2012/wordml" xmlns:wpg="http://schemas.microsoft.com/office/word/2010/wordprocessingGroup" xmlns:wpi="http://schemas.microsoft.com/office/word/2010/wordprocessingInk" xmlns:wne="http://schemas.microsoft.com/office/word/2006/wordml" xmlns:wps="http://schemas.microsoft.com/office/word/2010/wordprocessingShape" xmlns:w16se="http://schemas.microsoft.com/office/word/2015/wordml/symex" xmlns:w16cid="http://schemas.microsoft.com/office/word/2016/wordml/cid" xmlns:w16="http://schemas.microsoft.com/office/word/2018/wordml" xmlns:w16cex="http://schemas.microsoft.com/office/word/2018/wordml/cex" xmlns:w16sdtdh="http://schemas.microsoft.com/office/word/2020/wordml/sdtdatahash" xmlns:w16sdtfl="http://schemas.microsoft.com/office/word/2024/wordml/sdtformatlock" mc:Ignorable="w14 w15 wp14 w16se w16cid w16 w16cex w16sdtdh w16sdtfl">
   <w:body>
-    <w:p/>
+    <w:p>
+      <w:pPr>
+        <w:pStyle w:val="Normal"/>
+      </w:pPr>
+    </w:p>
     <w:sectPr>
-      <w:footerReference w:type="default" r:id="rId6"/>
-      <w:pgSz w:w="12240" w:h="15840"/>
+      <w:headerReference w:type="default" r:id="Recbea8f9d5ca4316"/>
+      <w:footerReference w:type="default" r:id="R599f4c8959af4299"/>
+      <w:pgSz w:w="12240" w:h="15840" w:orient="portrait"/>
       <w:pgMar w:top="1440" w:right="1440" w:bottom="1440" w:left="1440" w:header="720" w:footer="720" w:gutter="0"/>
       <w:cols w:space="720"/>
       <w:docGrid w:linePitch="360"/>
@@ -14,8 +19,8 @@
 </w:document>
 </file>
 
-<file path=word/footer1.xml><?xml version="1.0" encoding="utf-8"?>
-<w:ftr xmlns:w="http://schemas.openxmlformats.org/wordprocessingml/2006/main">
+<file path=word/footer.xml><?xml version="1.0" encoding="utf-8"?>
+<w:ftr xmlns:w14="http://schemas.microsoft.com/office/word/2010/wordml" xmlns:w="http://schemas.openxmlformats.org/wordprocessingml/2006/main">
   <w:p>
     <w:pPr>
       <w:jc w:val="center"/>
@@ -29,8 +34,78 @@
 </w:ftr>
 </file>
 
+<file path=word/header.xml><?xml version="1.0" encoding="utf-8"?>
+<w:hdr xmlns:w14="http://schemas.microsoft.com/office/word/2010/wordml" xmlns:w="http://schemas.openxmlformats.org/wordprocessingml/2006/main">
+  <w:tbl>
+    <w:tblPr>
+      <w:tblStyle w:val="TableNormal"/>
+      <w:bidiVisual w:val="0"/>
+      <w:tblW w:w="0" w:type="auto"/>
+      <w:tblLook w:val="06A0" w:firstRow="1" w:lastRow="0" w:firstColumn="1" w:lastColumn="0" w:noHBand="1" w:noVBand="1"/>
+    </w:tblPr>
+    <w:tblGrid>
+      <w:gridCol w:w="3120"/>
+      <w:gridCol w:w="3120"/>
+      <w:gridCol w:w="3120"/>
+    </w:tblGrid>
+    <w:tr>
+      <w:trPr>
+        <w:trHeight w:val="300"/>
+      </w:trPr>
+      <w:tc>
+        <w:tcPr>
+          <w:tcW w:w="3120" w:type="dxa"/>
+          <w:tcMar/>
+        </w:tcPr>
+        <w:p>
+          <w:pPr>
+            <w:pStyle w:val="Header"/>
+            <w:bidi w:val="0"/>
+            <w:ind w:left="-115"/>
+            <w:jc w:val="left"/>
+          </w:pPr>
+        </w:p>
+      </w:tc>
+      <w:tc>
+        <w:tcPr>
+          <w:tcW w:w="3120" w:type="dxa"/>
+          <w:tcMar/>
+        </w:tcPr>
+        <w:p>
+          <w:pPr>
+            <w:pStyle w:val="Header"/>
+            <w:bidi w:val="0"/>
+            <w:jc w:val="center"/>
+          </w:pPr>
+        </w:p>
+      </w:tc>
+      <w:tc>
+        <w:tcPr>
+          <w:tcW w:w="3120" w:type="dxa"/>
+          <w:tcMar/>
+        </w:tcPr>
+        <w:p>
+          <w:pPr>
+            <w:pStyle w:val="Header"/>
+            <w:bidi w:val="0"/>
+            <w:ind w:right="-115"/>
+            <w:jc w:val="right"/>
+          </w:pPr>
+        </w:p>
+      </w:tc>
+    </w:tr>
+  </w:tbl>
+  <w:p>
+    <w:pPr>
+      <w:pStyle w:val="Header"/>
+      <w:bidi w:val="0"/>
+    </w:pPr>
+  </w:p>
+</w:hdr>
+</file>
+
 <file path=word/styles.xml><?xml version="1.0" encoding="utf-8"?>
-<w:styles xmlns:mc="http://schemas.openxmlformats.org/markup-compatibility/2006" xmlns:r="http://schemas.openxmlformats.org/officeDocument/2006/relationships" xmlns:w="http://schemas.openxmlformats.org/wordprocessingml/2006/main" xmlns:w14="http://schemas.microsoft.com/office/word/2010/wordml" xmlns:w15="http://schemas.microsoft.com/office/word/2012/wordml" xmlns:w16cex="http://schemas.microsoft.com/office/word/2018/wordml/cex" xmlns:w16cid="http://schemas.microsoft.com/office/word/2016/wordml/cid" xmlns:w16="http://schemas.microsoft.com/office/word/2018/wordml" xmlns:w16sdtdh="http://schemas.microsoft.com/office/word/2020/wordml/sdtdatahash" xmlns:w16sdtfl="http://schemas.microsoft.com/office/word/2024/wordml/sdtformatlock" xmlns:w16se="http://schemas.microsoft.com/office/word/2015/wordml/symex" xmlns:w16du="http://schemas.microsoft.com/office/word/2023/wordml/word16du" mc:Ignorable="w14 w15 w16se w16cid w16 w16cex w16sdtdh w16sdtfl w16du">
+<w:styles xmlns:wp14="http://schemas.microsoft.com/office/word/2010/wordprocessingDrawing" xmlns:mc="http://schemas.openxmlformats.org/markup-compatibility/2006" xmlns:r="http://schemas.openxmlformats.org/officeDocument/2006/relationships" xmlns:w="http://schemas.openxmlformats.org/wordprocessingml/2006/main" xmlns:w14="http://schemas.microsoft.com/office/word/2010/wordml" xmlns:w15="http://schemas.microsoft.com/office/word/2012/wordml" xmlns:w16se="http://schemas.microsoft.com/office/word/2015/wordml/symex" xmlns:w16cid="http://schemas.microsoft.com/office/word/2016/wordml/cid" xmlns:w16="http://schemas.microsoft.com/office/word/2018/wordml" xmlns:w16cex="http://schemas.microsoft.com/office/word/2018/wordml/cex" xmlns:w16sdtdh="http://schemas.microsoft.com/office/word/2020/wordml/sdtdatahash" xmlns:w16sdtfl="http://schemas.microsoft.com/office/word/2024/wordml/sdtformatlock" mc:Ignorable="w14 w15 wp14 w16se w16cid w16 w16cex w16sdtdh w16sdtfl">
   <w:docDefaults>
     <w:rPrDefault>
       <w:rPr>
@@ -42,21 +117,21 @@
     </w:rPrDefault>
     <w:pPrDefault>
       <w:pPr>
-        <w:spacing w:after="160" w:line="278" w:lineRule="auto"/>
+        <w:spacing w:after="160" w:line="279" w:lineRule="auto"/>
       </w:pPr>
     </w:pPrDefault>
   </w:docDefaults>
-  <w:latentStyles w:defLockedState="0" w:defUIPriority="99" w:defSemiHidden="0" w:defUnhideWhenUsed="0" w:defQFormat="0" w:count="376">
+  <w:latentStyles w:defLockedState="0" w:defUIPriority="99" w:defSemiHidden="0" w:defUnhideWhenUsed="0" w:defQFormat="0" w:count="371">
     <w:lsdException w:name="Normal" w:uiPriority="0" w:qFormat="1"/>
     <w:lsdException w:name="heading 1" w:uiPriority="9" w:qFormat="1"/>
-    <w:lsdException w:name="heading 2" w:semiHidden="1" w:uiPriority="9" w:unhideWhenUsed="1" w:qFormat="1"/>
-    <w:lsdException w:name="heading 3" w:semiHidden="1" w:uiPriority="9" w:unhideWhenUsed="1" w:qFormat="1"/>
-    <w:lsdException w:name="heading 4" w:semiHidden="1" w:uiPriority="9" w:unhideWhenUsed="1" w:qFormat="1"/>
-    <w:lsdException w:name="heading 5" w:semiHidden="1" w:uiPriority="9" w:unhideWhenUsed="1" w:qFormat="1"/>
-    <w:lsdException w:name="heading 6" w:semiHidden="1" w:uiPriority="9" w:unhideWhenUsed="1" w:qFormat="1"/>
-    <w:lsdException w:name="heading 7" w:semiHidden="1" w:uiPriority="9" w:unhideWhenUsed="1" w:qFormat="1"/>
-    <w:lsdException w:name="heading 8" w:semiHidden="1" w:uiPriority="9" w:unhideWhenUsed="1" w:qFormat="1"/>
-    <w:lsdException w:name="heading 9" w:semiHidden="1" w:uiPriority="9" w:unhideWhenUsed="1" w:qFormat="1"/>
+    <w:lsdException w:name="heading 2" w:uiPriority="9" w:semiHidden="1" w:unhideWhenUsed="1" w:qFormat="1"/>
+    <w:lsdException w:name="heading 3" w:uiPriority="9" w:semiHidden="1" w:unhideWhenUsed="1" w:qFormat="1"/>
+    <w:lsdException w:name="heading 4" w:uiPriority="9" w:semiHidden="1" w:unhideWhenUsed="1" w:qFormat="1"/>
+    <w:lsdException w:name="heading 5" w:uiPriority="9" w:semiHidden="1" w:unhideWhenUsed="1" w:qFormat="1"/>
+    <w:lsdException w:name="heading 6" w:uiPriority="9" w:semiHidden="1" w:unhideWhenUsed="1" w:qFormat="1"/>
+    <w:lsdException w:name="heading 7" w:uiPriority="9" w:semiHidden="1" w:unhideWhenUsed="1" w:qFormat="1"/>
+    <w:lsdException w:name="heading 8" w:uiPriority="9" w:semiHidden="1" w:unhideWhenUsed="1" w:qFormat="1"/>
+    <w:lsdException w:name="heading 9" w:uiPriority="9" w:semiHidden="1" w:unhideWhenUsed="1" w:qFormat="1"/>
     <w:lsdException w:name="index 1" w:semiHidden="1" w:unhideWhenUsed="1"/>
     <w:lsdException w:name="index 2" w:semiHidden="1" w:unhideWhenUsed="1"/>
     <w:lsdException w:name="index 3" w:semiHidden="1" w:unhideWhenUsed="1"/>
@@ -66,22 +141,22 @@
     <w:lsdException w:name="index 7" w:semiHidden="1" w:unhideWhenUsed="1"/>
     <w:lsdException w:name="index 8" w:semiHidden="1" w:unhideWhenUsed="1"/>
     <w:lsdException w:name="index 9" w:semiHidden="1" w:unhideWhenUsed="1"/>
-    <w:lsdException w:name="toc 1" w:semiHidden="1" w:uiPriority="39" w:unhideWhenUsed="1"/>
-    <w:lsdException w:name="toc 2" w:semiHidden="1" w:uiPriority="39" w:unhideWhenUsed="1"/>
-    <w:lsdException w:name="toc 3" w:semiHidden="1" w:uiPriority="39" w:unhideWhenUsed="1"/>
-    <w:lsdException w:name="toc 4" w:semiHidden="1" w:uiPriority="39" w:unhideWhenUsed="1"/>
-    <w:lsdException w:name="toc 5" w:semiHidden="1" w:uiPriority="39" w:unhideWhenUsed="1"/>
-    <w:lsdException w:name="toc 6" w:semiHidden="1" w:uiPriority="39" w:unhideWhenUsed="1"/>
-    <w:lsdException w:name="toc 7" w:semiHidden="1" w:uiPriority="39" w:unhideWhenUsed="1"/>
-    <w:lsdException w:name="toc 8" w:semiHidden="1" w:uiPriority="39" w:unhideWhenUsed="1"/>
-    <w:lsdException w:name="toc 9" w:semiHidden="1" w:uiPriority="39" w:unhideWhenUsed="1"/>
+    <w:lsdException w:name="toc 1" w:uiPriority="39" w:semiHidden="1" w:unhideWhenUsed="1"/>
+    <w:lsdException w:name="toc 2" w:uiPriority="39" w:semiHidden="1" w:unhideWhenUsed="1"/>
+    <w:lsdException w:name="toc 3" w:uiPriority="39" w:semiHidden="1" w:unhideWhenUsed="1"/>
+    <w:lsdException w:name="toc 4" w:uiPriority="39" w:semiHidden="1" w:unhideWhenUsed="1"/>
+    <w:lsdException w:name="toc 5" w:uiPriority="39" w:semiHidden="1" w:unhideWhenUsed="1"/>
+    <w:lsdException w:name="toc 6" w:uiPriority="39" w:semiHidden="1" w:unhideWhenUsed="1"/>
+    <w:lsdException w:name="toc 7" w:uiPriority="39" w:semiHidden="1" w:unhideWhenUsed="1"/>
+    <w:lsdException w:name="toc 8" w:uiPriority="39" w:semiHidden="1" w:unhideWhenUsed="1"/>
+    <w:lsdException w:name="toc 9" w:uiPriority="39" w:semiHidden="1" w:unhideWhenUsed="1"/>
     <w:lsdException w:name="Normal Indent" w:semiHidden="1" w:unhideWhenUsed="1"/>
     <w:lsdException w:name="footnote text" w:semiHidden="1" w:unhideWhenUsed="1"/>
     <w:lsdException w:name="annotation text" w:semiHidden="1" w:unhideWhenUsed="1"/>
     <w:lsdException w:name="header" w:semiHidden="1" w:unhideWhenUsed="1"/>
     <w:lsdException w:name="footer" w:semiHidden="1" w:unhideWhenUsed="1"/>
     <w:lsdException w:name="index heading" w:semiHidden="1" w:unhideWhenUsed="1"/>
-    <w:lsdException w:name="caption" w:semiHidden="1" w:uiPriority="35" w:unhideWhenUsed="1" w:qFormat="1"/>
+    <w:lsdException w:name="caption" w:uiPriority="35" w:semiHidden="1" w:unhideWhenUsed="1" w:qFormat="1"/>
     <w:lsdException w:name="table of figures" w:semiHidden="1" w:unhideWhenUsed="1"/>
     <w:lsdException w:name="envelope address" w:semiHidden="1" w:unhideWhenUsed="1"/>
     <w:lsdException w:name="envelope return" w:semiHidden="1" w:unhideWhenUsed="1"/>
@@ -112,7 +187,7 @@
     <w:lsdException w:name="Title" w:uiPriority="10" w:qFormat="1"/>
     <w:lsdException w:name="Closing" w:semiHidden="1" w:unhideWhenUsed="1"/>
     <w:lsdException w:name="Signature" w:semiHidden="1" w:unhideWhenUsed="1"/>
-    <w:lsdException w:name="Default Paragraph Font" w:semiHidden="1" w:uiPriority="1" w:unhideWhenUsed="1"/>
+    <w:lsdException w:name="Default Paragraph Font" w:uiPriority="1" w:semiHidden="1" w:unhideWhenUsed="1"/>
     <w:lsdException w:name="Body Text" w:semiHidden="1" w:unhideWhenUsed="1"/>
     <w:lsdException w:name="Body Text Indent" w:semiHidden="1" w:unhideWhenUsed="1"/>
     <w:lsdException w:name="List Continue" w:semiHidden="1" w:unhideWhenUsed="1"/>
@@ -312,8 +387,8 @@
     <w:lsdException w:name="Subtle Reference" w:uiPriority="31" w:qFormat="1"/>
     <w:lsdException w:name="Intense Reference" w:uiPriority="32" w:qFormat="1"/>
     <w:lsdException w:name="Book Title" w:uiPriority="33" w:qFormat="1"/>
-    <w:lsdException w:name="Bibliography" w:semiHidden="1" w:uiPriority="37" w:unhideWhenUsed="1"/>
-    <w:lsdException w:name="TOC Heading" w:semiHidden="1" w:uiPriority="39" w:unhideWhenUsed="1" w:qFormat="1"/>
+    <w:lsdException w:name="Bibliography" w:uiPriority="37" w:semiHidden="1" w:unhideWhenUsed="1"/>
+    <w:lsdException w:name="TOC Heading" w:uiPriority="39" w:semiHidden="1" w:unhideWhenUsed="1" w:qFormat="1"/>
     <w:lsdException w:name="Plain Table 1" w:uiPriority="41"/>
     <w:lsdException w:name="Plain Table 2" w:uiPriority="42"/>
     <w:lsdException w:name="Plain Table 3" w:uiPriority="43"/>
@@ -418,13 +493,8 @@
     <w:lsdException w:name="List Table 5 Dark Accent 6" w:uiPriority="50"/>
     <w:lsdException w:name="List Table 6 Colorful Accent 6" w:uiPriority="51"/>
     <w:lsdException w:name="List Table 7 Colorful Accent 6" w:uiPriority="52"/>
-    <w:lsdException w:name="Mention" w:semiHidden="1" w:unhideWhenUsed="1"/>
-    <w:lsdException w:name="Smart Hyperlink" w:semiHidden="1" w:unhideWhenUsed="1"/>
-    <w:lsdException w:name="Hashtag" w:semiHidden="1" w:unhideWhenUsed="1"/>
-    <w:lsdException w:name="Unresolved Mention" w:semiHidden="1" w:unhideWhenUsed="1"/>
-    <w:lsdException w:name="Smart Link" w:semiHidden="1" w:unhideWhenUsed="1"/>
   </w:latentStyles>
-  <w:style w:type="paragraph" w:default="1" w:styleId="Normal">
+  <w:style w:type="paragraph" w:styleId="Normal" w:default="1">
     <w:name w:val="Normal"/>
     <w:qFormat/>
     <w:pPr>
@@ -433,149 +503,13 @@
       <w:jc w:val="both"/>
     </w:pPr>
   </w:style>
-  <w:style w:type="paragraph" w:styleId="Heading1">
-    <w:name w:val="heading 1"/>
-    <w:basedOn w:val="Normal"/>
-    <w:next w:val="FirstParagraph"/>
-    <w:link w:val="Heading1Char"/>
-    <w:uiPriority w:val="9"/>
-    <w:qFormat/>
-    <w:rsid w:val="00F81AA1"/>
-    <w:pPr>
-      <w:spacing w:line="360" w:lineRule="auto" w:after="220"/>
-      <w:jc w:val="both"/>
-      <w:outlineLvl w:val="0"/>
-    </w:pPr>
-    <w:rPr>
-      <w:rFonts w:ascii="Times New Roman" w:hAnsi="Times New Roman" w:eastAsia="Times New Roman" w:cs="Times New Roman"/>
-      <w:b/>
-      <w:color w:val="auto"/>
-      <w:sz w:val="22"/>
-      <w:szCs w:val="22"/>
-    </w:rPr>
-  </w:style>
-  <w:style w:type="paragraph" w:styleId="Heading2">
-    <w:name w:val="heading 2"/>
-    <w:basedOn w:val="Normal"/>
-    <w:next w:val="FirstParagraph"/>
-    <w:link w:val="Heading2Char"/>
-    <w:uiPriority w:val="9"/>
-    <w:semiHidden/>
-    <w:unhideWhenUsed/>
-    <w:qFormat/>
-    <w:rsid w:val="00F81AA1"/>
-    <w:pPr>
-      <w:spacing w:line="360" w:lineRule="auto" w:after="220"/>
-      <w:jc w:val="both"/>
-      <w:outlineLvl w:val="1"/>
-    </w:pPr>
-    <w:rPr>
-      <w:rFonts w:ascii="Times New Roman" w:hAnsi="Times New Roman" w:eastAsia="Times New Roman" w:cs="Times New Roman"/>
-      <w:b/>
-      <w:color w:val="auto"/>
-      <w:sz w:val="22"/>
-      <w:szCs w:val="22"/>
-    </w:rPr>
-  </w:style>
-  <w:style w:type="paragraph" w:styleId="Heading3">
-    <w:name w:val="heading 3"/>
-    <w:basedOn w:val="Normal"/>
-    <w:next w:val="FirstParagraph"/>
-    <w:link w:val="Heading3Char"/>
-    <w:uiPriority w:val="9"/>
-    <w:semiHidden/>
-    <w:unhideWhenUsed/>
-    <w:qFormat/>
-    <w:rsid w:val="00F81AA1"/>
-    <w:pPr>
-      <w:spacing w:line="360" w:lineRule="auto" w:after="220"/>
-      <w:jc w:val="both"/>
-      <w:outlineLvl w:val="2"/>
-    </w:pPr>
-    <w:rPr>
-      <w:rFonts w:ascii="Times New Roman" w:hAnsi="Times New Roman" w:eastAsia="Times New Roman" w:cs="Times New Roman"/>
-      <w:b/>
-      <w:color w:val="auto"/>
-      <w:sz w:val="22"/>
-      <w:szCs w:val="22"/>
-    </w:rPr>
-  </w:style>
-  <w:style w:type="paragraph" w:styleId="Heading4">
-    <w:name w:val="heading 4"/>
-    <w:basedOn w:val="Normal"/>
-    <w:next w:val="FirstParagraph"/>
-    <w:link w:val="Heading4Char"/>
-    <w:uiPriority w:val="9"/>
-    <w:semiHidden/>
-    <w:unhideWhenUsed/>
-    <w:qFormat/>
-    <w:rsid w:val="00F81AA1"/>
-    <w:pPr>
-      <w:spacing w:line="360" w:lineRule="auto" w:after="220"/>
-      <w:jc w:val="both"/>
-      <w:outlineLvl w:val="3"/>
-    </w:pPr>
-    <w:rPr>
-      <w:rFonts w:ascii="Times New Roman" w:hAnsi="Times New Roman" w:eastAsia="Times New Roman" w:cs="Times New Roman"/>
-      <w:b/>
-      <w:color w:val="auto"/>
-      <w:sz w:val="22"/>
-      <w:szCs w:val="22"/>
-    </w:rPr>
-  </w:style>
-  <w:style w:type="paragraph" w:styleId="Heading5">
-    <w:name w:val="heading 5"/>
-    <w:basedOn w:val="Normal"/>
-    <w:next w:val="FirstParagraph"/>
-    <w:link w:val="Heading5Char"/>
-    <w:uiPriority w:val="9"/>
-    <w:semiHidden/>
-    <w:unhideWhenUsed/>
-    <w:qFormat/>
-    <w:rsid w:val="00F81AA1"/>
-    <w:pPr>
-      <w:spacing w:line="360" w:lineRule="auto" w:after="220"/>
-      <w:jc w:val="both"/>
-      <w:outlineLvl w:val="4"/>
-    </w:pPr>
-    <w:rPr>
-      <w:rFonts w:ascii="Times New Roman" w:hAnsi="Times New Roman" w:eastAsia="Times New Roman" w:cs="Times New Roman"/>
-      <w:b/>
-      <w:color w:val="auto"/>
-      <w:sz w:val="22"/>
-      <w:szCs w:val="22"/>
-    </w:rPr>
-  </w:style>
-  <w:style w:type="paragraph" w:styleId="Heading6">
-    <w:name w:val="heading 6"/>
-    <w:basedOn w:val="Normal"/>
-    <w:next w:val="FirstParagraph"/>
-    <w:link w:val="Heading6Char"/>
-    <w:uiPriority w:val="9"/>
-    <w:semiHidden/>
-    <w:unhideWhenUsed/>
-    <w:qFormat/>
-    <w:rsid w:val="00F81AA1"/>
-    <w:pPr>
-      <w:spacing w:line="360" w:lineRule="auto" w:after="220"/>
-      <w:jc w:val="both"/>
-      <w:outlineLvl w:val="5"/>
-    </w:pPr>
-    <w:rPr>
-      <w:rFonts w:ascii="Times New Roman" w:hAnsi="Times New Roman" w:eastAsia="Times New Roman" w:cs="Times New Roman"/>
-      <w:b/>
-      <w:color w:val="auto"/>
-      <w:sz w:val="22"/>
-      <w:szCs w:val="22"/>
-    </w:rPr>
-  </w:style>
-  <w:style w:type="character" w:default="1" w:styleId="DefaultParagraphFont">
+  <w:style w:type="character" w:styleId="DefaultParagraphFont" w:default="1">
     <w:name w:val="Default Paragraph Font"/>
     <w:uiPriority w:val="1"/>
     <w:semiHidden/>
     <w:unhideWhenUsed/>
   </w:style>
-  <w:style w:type="table" w:default="1" w:styleId="TableNormal">
+  <w:style w:type="table" w:styleId="TableNormal" w:default="1">
     <w:name w:val="Normal Table"/>
     <w:uiPriority w:val="99"/>
     <w:semiHidden/>
@@ -590,133 +524,208 @@
       </w:tblCellMar>
     </w:tblPr>
   </w:style>
-  <w:style w:type="numbering" w:default="1" w:styleId="NoList">
+  <w:style w:type="numbering" w:styleId="NoList" w:default="1">
     <w:name w:val="No List"/>
     <w:uiPriority w:val="99"/>
     <w:semiHidden/>
     <w:unhideWhenUsed/>
   </w:style>
-  <w:style w:type="character" w:customStyle="1" w:styleId="Heading1Char">
-    <w:name w:val="Heading 1 Char"/>
-    <w:basedOn w:val="DefaultParagraphFont"/>
-    <w:link w:val="Heading1"/>
+  <w:style w:type="paragraph" w:styleId="Header">
+    <w:uiPriority w:val="99"/>
+    <w:name w:val="header"/>
+    <w:basedOn w:val="Normal"/>
+    <w:unhideWhenUsed/>
+    <w:rsid w:val="21362DC7"/>
+    <w:pPr>
+      <w:tabs>
+        <w:tab w:val="center" w:leader="none" w:pos="4680"/>
+        <w:tab w:val="right" w:leader="none" w:pos="9360"/>
+      </w:tabs>
+      <w:spacing w:after="0" w:line="240" w:lineRule="auto"/>
+    </w:pPr>
+  </w:style>
+  <w:style w:type="paragraph" w:styleId="Footer">
+    <w:uiPriority w:val="99"/>
+    <w:name w:val="footer"/>
+    <w:basedOn w:val="Normal"/>
+    <w:unhideWhenUsed/>
+    <w:rsid w:val="21362DC7"/>
+    <w:pPr>
+      <w:tabs>
+        <w:tab w:val="center" w:leader="none" w:pos="4680"/>
+        <w:tab w:val="right" w:leader="none" w:pos="9360"/>
+      </w:tabs>
+      <w:spacing w:after="0" w:line="240" w:lineRule="auto"/>
+    </w:pPr>
+  </w:style>
+  <w:style w:type="paragraph" w:styleId="Quote">
+    <w:uiPriority w:val="29"/>
+    <w:name w:val="Quote"/>
+    <w:basedOn w:val="Normal"/>
+    <w:next w:val="FirstParagraph"/>
+    <w:qFormat/>
+    <w:rsid w:val="4425367B"/>
+    <w:rPr>
+      <w:i w:val="1"/>
+      <w:iCs w:val="1"/>
+      <w:color w:val="404040" w:themeColor="text1" w:themeTint="BF" w:themeShade="FF"/>
+    </w:rPr>
+    <w:pPr>
+      <w:spacing w:before="160"/>
+      <w:ind w:left="720"/>
+    </w:pPr>
+  </w:style>
+  <w:style w:type="paragraph" w:styleId="Heading1">
     <w:uiPriority w:val="9"/>
-    <w:rsid w:val="00F81AA1"/>
-    <w:rPr>
-      <w:rFonts w:asciiTheme="majorHAnsi" w:eastAsiaTheme="majorEastAsia" w:hAnsiTheme="majorHAnsi" w:cstheme="majorBidi"/>
-      <w:color w:val="0F4761" w:themeColor="accent1" w:themeShade="BF"/>
-      <w:sz w:val="40"/>
-      <w:szCs w:val="40"/>
-    </w:rPr>
-  </w:style>
-  <w:style w:type="character" w:customStyle="1" w:styleId="Heading2Char">
-    <w:name w:val="Heading 2 Char"/>
-    <w:basedOn w:val="DefaultParagraphFont"/>
-    <w:link w:val="Heading2"/>
+    <w:name w:val="heading 1"/>
+    <w:basedOn w:val="Normal"/>
+    <w:next w:val="FirstParagraph"/>
+    <w:qFormat/>
+    <w:rsid w:val="4425367B"/>
+    <w:pPr>
+      <w:spacing w:line="360" w:lineRule="auto" w:after="220"/>
+      <w:jc w:val="both"/>
+      <w:outlineLvl w:val="0"/>
+    </w:pPr>
+    <w:rPr>
+      <w:rFonts w:ascii="Times New Roman" w:hAnsi="Times New Roman" w:eastAsia="Times New Roman" w:cs="Times New Roman"/>
+      <w:b/>
+      <w:color w:val="auto"/>
+      <w:sz w:val="22"/>
+      <w:szCs w:val="22"/>
+    </w:rPr>
+  </w:style>
+  <w:style w:type="paragraph" w:styleId="ListParagraph">
+    <w:uiPriority w:val="34"/>
+    <w:name w:val="List Paragraph"/>
+    <w:basedOn w:val="Normal"/>
+    <w:qFormat/>
+    <w:rsid w:val="4425367B"/>
+    <w:pPr>
+      <w:spacing/>
+      <w:ind w:left="720"/>
+      <w:contextualSpacing/>
+    </w:pPr>
+  </w:style>
+  <w:style w:type="paragraph" w:styleId="Heading2">
     <w:uiPriority w:val="9"/>
-    <w:semiHidden/>
-    <w:rsid w:val="00F81AA1"/>
-    <w:rPr>
-      <w:rFonts w:asciiTheme="majorHAnsi" w:eastAsiaTheme="majorEastAsia" w:hAnsiTheme="majorHAnsi" w:cstheme="majorBidi"/>
-      <w:color w:val="0F4761" w:themeColor="accent1" w:themeShade="BF"/>
-      <w:sz w:val="32"/>
-      <w:szCs w:val="32"/>
-    </w:rPr>
-  </w:style>
-  <w:style w:type="character" w:customStyle="1" w:styleId="Heading3Char">
-    <w:name w:val="Heading 3 Char"/>
-    <w:basedOn w:val="DefaultParagraphFont"/>
-    <w:link w:val="Heading3"/>
+    <w:name w:val="heading 2"/>
+    <w:basedOn w:val="Normal"/>
+    <w:next w:val="FirstParagraph"/>
+    <w:unhideWhenUsed/>
+    <w:qFormat/>
+    <w:rsid w:val="4425367B"/>
+    <w:pPr>
+      <w:spacing w:line="360" w:lineRule="auto" w:after="220"/>
+      <w:jc w:val="both"/>
+      <w:outlineLvl w:val="1"/>
+    </w:pPr>
+    <w:rPr>
+      <w:rFonts w:ascii="Times New Roman" w:hAnsi="Times New Roman" w:eastAsia="Times New Roman" w:cs="Times New Roman"/>
+      <w:b/>
+      <w:color w:val="auto"/>
+      <w:sz w:val="22"/>
+      <w:szCs w:val="22"/>
+    </w:rPr>
+  </w:style>
+  <w:style w:type="paragraph" w:styleId="Heading3">
     <w:uiPriority w:val="9"/>
-    <w:semiHidden/>
-    <w:rsid w:val="00F81AA1"/>
-    <w:rPr>
-      <w:rFonts w:eastAsiaTheme="majorEastAsia" w:cstheme="majorBidi"/>
-      <w:color w:val="0F4761" w:themeColor="accent1" w:themeShade="BF"/>
+    <w:name w:val="heading 3"/>
+    <w:basedOn w:val="Normal"/>
+    <w:next w:val="FirstParagraph"/>
+    <w:unhideWhenUsed/>
+    <w:qFormat/>
+    <w:rsid w:val="4425367B"/>
+    <w:pPr>
+      <w:spacing w:line="360" w:lineRule="auto" w:after="220"/>
+      <w:jc w:val="both"/>
+      <w:outlineLvl w:val="2"/>
+    </w:pPr>
+    <w:rPr>
+      <w:rFonts w:ascii="Times New Roman" w:hAnsi="Times New Roman" w:eastAsia="Times New Roman" w:cs="Times New Roman"/>
+      <w:b/>
+      <w:color w:val="auto"/>
+      <w:sz w:val="22"/>
+      <w:szCs w:val="22"/>
+    </w:rPr>
+  </w:style>
+  <w:style w:type="paragraph" w:styleId="Heading4">
+    <w:uiPriority w:val="9"/>
+    <w:name w:val="heading 4"/>
+    <w:basedOn w:val="Normal"/>
+    <w:next w:val="FirstParagraph"/>
+    <w:unhideWhenUsed/>
+    <w:qFormat/>
+    <w:rsid w:val="4425367B"/>
+    <w:pPr>
+      <w:spacing w:line="360" w:lineRule="auto" w:after="220"/>
+      <w:jc w:val="both"/>
+      <w:outlineLvl w:val="3"/>
+    </w:pPr>
+    <w:rPr>
+      <w:rFonts w:ascii="Times New Roman" w:hAnsi="Times New Roman" w:eastAsia="Times New Roman" w:cs="Times New Roman"/>
+      <w:b/>
+      <w:color w:val="auto"/>
+      <w:sz w:val="22"/>
+      <w:szCs w:val="22"/>
+    </w:rPr>
+  </w:style>
+  <w:style w:type="paragraph" w:styleId="Heading5">
+    <w:uiPriority w:val="9"/>
+    <w:name w:val="heading 5"/>
+    <w:basedOn w:val="Normal"/>
+    <w:next w:val="FirstParagraph"/>
+    <w:unhideWhenUsed/>
+    <w:qFormat/>
+    <w:rsid w:val="4425367B"/>
+    <w:pPr>
+      <w:spacing w:line="360" w:lineRule="auto" w:after="220"/>
+      <w:jc w:val="both"/>
+      <w:outlineLvl w:val="4"/>
+    </w:pPr>
+    <w:rPr>
+      <w:rFonts w:ascii="Times New Roman" w:hAnsi="Times New Roman" w:eastAsia="Times New Roman" w:cs="Times New Roman"/>
+      <w:b/>
+      <w:color w:val="auto"/>
+      <w:sz w:val="22"/>
+      <w:szCs w:val="22"/>
+    </w:rPr>
+  </w:style>
+  <w:style w:type="paragraph" w:styleId="Heading6">
+    <w:uiPriority w:val="9"/>
+    <w:name w:val="heading 6"/>
+    <w:basedOn w:val="Normal"/>
+    <w:next w:val="FirstParagraph"/>
+    <w:unhideWhenUsed/>
+    <w:qFormat/>
+    <w:rsid w:val="4425367B"/>
+    <w:pPr>
+      <w:spacing w:line="360" w:lineRule="auto" w:after="220"/>
+      <w:jc w:val="both"/>
+      <w:outlineLvl w:val="5"/>
+    </w:pPr>
+    <w:rPr>
+      <w:rFonts w:ascii="Times New Roman" w:hAnsi="Times New Roman" w:eastAsia="Times New Roman" w:cs="Times New Roman"/>
+      <w:b/>
+      <w:color w:val="auto"/>
+      <w:sz w:val="22"/>
+      <w:szCs w:val="22"/>
+    </w:rPr>
+  </w:style>
+  <w:style w:type="paragraph" w:styleId="Title">
+    <w:uiPriority w:val="10"/>
+    <w:name w:val="Title"/>
+    <w:basedOn w:val="Normal"/>
+    <w:next w:val="FirstParagraph"/>
+    <w:qFormat/>
+    <w:rsid w:val="4425367B"/>
+    <w:pPr>
+      <w:jc w:val="center"/>
+    </w:pPr>
+    <w:rPr>
       <w:sz w:val="28"/>
       <w:szCs w:val="28"/>
     </w:rPr>
-  </w:style>
-  <w:style w:type="character" w:customStyle="1" w:styleId="Heading4Char">
-    <w:name w:val="Heading 4 Char"/>
-    <w:basedOn w:val="DefaultParagraphFont"/>
-    <w:link w:val="Heading4"/>
-    <w:uiPriority w:val="9"/>
-    <w:semiHidden/>
-    <w:rsid w:val="00F81AA1"/>
-    <w:rPr>
-      <w:rFonts w:eastAsiaTheme="majorEastAsia" w:cstheme="majorBidi"/>
-      <w:i/>
-      <w:iCs/>
-      <w:color w:val="0F4761" w:themeColor="accent1" w:themeShade="BF"/>
-    </w:rPr>
-  </w:style>
-  <w:style w:type="character" w:customStyle="1" w:styleId="Heading5Char">
-    <w:name w:val="Heading 5 Char"/>
-    <w:basedOn w:val="DefaultParagraphFont"/>
-    <w:link w:val="Heading5"/>
-    <w:uiPriority w:val="9"/>
-    <w:semiHidden/>
-    <w:rsid w:val="00F81AA1"/>
-    <w:rPr>
-      <w:rFonts w:eastAsiaTheme="majorEastAsia" w:cstheme="majorBidi"/>
-      <w:color w:val="0F4761" w:themeColor="accent1" w:themeShade="BF"/>
-    </w:rPr>
-  </w:style>
-  <w:style w:type="character" w:customStyle="1" w:styleId="Heading6Char">
-    <w:name w:val="Heading 6 Char"/>
-    <w:basedOn w:val="DefaultParagraphFont"/>
-    <w:link w:val="Heading6"/>
-    <w:uiPriority w:val="9"/>
-    <w:semiHidden/>
-    <w:rsid w:val="00F81AA1"/>
-    <w:rPr>
-      <w:rFonts w:eastAsiaTheme="majorEastAsia" w:cstheme="majorBidi"/>
-      <w:i/>
-      <w:iCs/>
-      <w:color w:val="595959" w:themeColor="text1" w:themeTint="A6"/>
-    </w:rPr>
-  </w:style>
-  <w:style w:type="paragraph" w:styleId="Quote">
-    <w:name w:val="Quote"/>
-    <w:basedOn w:val="Normal"/>
-    <w:next w:val="FirstParagraph"/>
-    <w:link w:val="QuoteChar"/>
-    <w:uiPriority w:val="29"/>
-    <w:qFormat/>
-    <w:rsid w:val="00F81AA1"/>
-    <w:pPr>
-      <w:spacing w:before="160"/>
-      <w:ind w:left="720"/>
-    </w:pPr>
-    <w:rPr>
-      <w:i/>
-      <w:iCs/>
-      <w:color w:val="404040" w:themeColor="text1" w:themeTint="BF"/>
-    </w:rPr>
-  </w:style>
-  <w:style w:type="character" w:customStyle="1" w:styleId="QuoteChar">
-    <w:name w:val="Quote Char"/>
-    <w:basedOn w:val="DefaultParagraphFont"/>
-    <w:link w:val="Quote"/>
-    <w:uiPriority w:val="29"/>
-    <w:rsid w:val="00F81AA1"/>
-    <w:rPr>
-      <w:i/>
-      <w:iCs/>
-      <w:color w:val="404040" w:themeColor="text1" w:themeTint="BF"/>
-    </w:rPr>
-  </w:style>
-  <w:style w:type="paragraph" w:styleId="ListParagraph">
-    <w:name w:val="List Paragraph"/>
-    <w:basedOn w:val="Normal"/>
-    <w:uiPriority w:val="34"/>
-    <w:qFormat/>
-    <w:rsid w:val="00F81AA1"/>
-    <w:pPr>
-      <w:ind w:left="720"/>
-      <w:contextualSpacing/>
-    </w:pPr>
   </w:style>
   <w:style w:type="paragraph" w:styleId="BodyText">
     <w:name w:val="Body Text"/>
@@ -730,6 +739,16 @@
     <w:next w:val="BodyText"/>
     <w:uiPriority w:val="1"/>
     <w:qFormat/>
+  </w:style>
+  <w:style w:type="paragraph" w:customStyle="1" w:styleId="Centered">
+    <w:name w:val="Centered"/>
+    <w:basedOn w:val="BodyText"/>
+    <w:next w:val="BodyText"/>
+    <w:qFormat/>
+    <w:pPr>
+      <w:ind w:firstLine="0"/>
+      <w:jc w:val="center"/>
+    </w:pPr>
   </w:style>
   <w:style w:type="paragraph" w:customStyle="1" w:styleId="Compact">
     <w:name w:val="Compact"/>
@@ -870,35 +889,11 @@
       <w:spacing w:after="0" w:line="240" w:lineRule="auto"/>
     </w:pPr>
   </w:style>
-  <w:style w:type="paragraph" w:styleId="Title">
-    <w:name w:val="Title"/>
-    <w:basedOn w:val="Normal"/>
-    <w:next w:val="FirstParagraph"/>
-    <w:uiPriority w:val="10"/>
-    <w:qFormat/>
-    <w:pPr>
-      <w:jc w:val="center"/>
-    </w:pPr>
-    <w:rPr>
-      <w:sz w:val="28"/>
-      <w:szCs w:val="28"/>
-    </w:rPr>
-  </w:style>
-  <w:style w:type="paragraph" w:customStyle="1" w:styleId="Centered">
-    <w:name w:val="Centered"/>
-    <w:basedOn w:val="BodyText"/>
-    <w:next w:val="BodyText"/>
-    <w:qFormat/>
-    <w:pPr>
-      <w:ind w:firstLine="0"/>
-      <w:jc w:val="center"/>
-    </w:pPr>
-  </w:style>
 </w:styles>
 </file>
 
 <file path=word/theme/theme1.xml><?xml version="1.0" encoding="utf-8"?>
-<a:theme xmlns:a="http://schemas.openxmlformats.org/drawingml/2006/main" name="Office Theme">
+<a:theme xmlns:thm15="http://schemas.microsoft.com/office/thememl/2012/main" xmlns:a="http://schemas.openxmlformats.org/drawingml/2006/main" name="Office Theme">
   <a:themeElements>
     <a:clrScheme name="Office">
       <a:dk1>
@@ -943,9 +938,9 @@
         <a:latin typeface="Aptos Display" panose="02110004020202020204"/>
         <a:ea typeface=""/>
         <a:cs typeface=""/>
-        <a:font script="Jpan" typeface="游ゴシック Light"/>
+        <a:font script="Jpan" typeface="ＭＳ ゴシック"/>
         <a:font script="Hang" typeface="맑은 고딕"/>
-        <a:font script="Hans" typeface="等线 Light"/>
+        <a:font script="Hans" typeface="宋体"/>
         <a:font script="Hant" typeface="新細明體"/>
         <a:font script="Arab" typeface="Times New Roman"/>
         <a:font script="Hebr" typeface="Times New Roman"/>
@@ -973,31 +968,14 @@
         <a:font script="Viet" typeface="Times New Roman"/>
         <a:font script="Uigh" typeface="Microsoft Uighur"/>
         <a:font script="Geor" typeface="Sylfaen"/>
-        <a:font script="Armn" typeface="Arial"/>
-        <a:font script="Bugi" typeface="Leelawadee UI"/>
-        <a:font script="Bopo" typeface="Microsoft JhengHei"/>
-        <a:font script="Java" typeface="Javanese Text"/>
-        <a:font script="Lisu" typeface="Segoe UI"/>
-        <a:font script="Mymr" typeface="Myanmar Text"/>
-        <a:font script="Nkoo" typeface="Ebrima"/>
-        <a:font script="Olck" typeface="Nirmala UI"/>
-        <a:font script="Osma" typeface="Ebrima"/>
-        <a:font script="Phag" typeface="Phagspa"/>
-        <a:font script="Syrn" typeface="Estrangelo Edessa"/>
-        <a:font script="Syrj" typeface="Estrangelo Edessa"/>
-        <a:font script="Syre" typeface="Estrangelo Edessa"/>
-        <a:font script="Sora" typeface="Nirmala UI"/>
-        <a:font script="Tale" typeface="Microsoft Tai Le"/>
-        <a:font script="Talu" typeface="Microsoft New Tai Lue"/>
-        <a:font script="Tfng" typeface="Ebrima"/>
       </a:majorFont>
       <a:minorFont>
         <a:latin typeface="Aptos" panose="02110004020202020204"/>
         <a:ea typeface=""/>
         <a:cs typeface=""/>
-        <a:font script="Jpan" typeface="游明朝"/>
+        <a:font script="Jpan" typeface="ＭＳ 明朝"/>
         <a:font script="Hang" typeface="맑은 고딕"/>
-        <a:font script="Hans" typeface="等线"/>
+        <a:font script="Hans" typeface="宋体"/>
         <a:font script="Hant" typeface="新細明體"/>
         <a:font script="Arab" typeface="Arial"/>
         <a:font script="Hebr" typeface="Arial"/>
@@ -1025,23 +1003,6 @@
         <a:font script="Viet" typeface="Arial"/>
         <a:font script="Uigh" typeface="Microsoft Uighur"/>
         <a:font script="Geor" typeface="Sylfaen"/>
-        <a:font script="Armn" typeface="Arial"/>
-        <a:font script="Bugi" typeface="Leelawadee UI"/>
-        <a:font script="Bopo" typeface="Microsoft JhengHei"/>
-        <a:font script="Java" typeface="Javanese Text"/>
-        <a:font script="Lisu" typeface="Segoe UI"/>
-        <a:font script="Mymr" typeface="Myanmar Text"/>
-        <a:font script="Nkoo" typeface="Ebrima"/>
-        <a:font script="Olck" typeface="Nirmala UI"/>
-        <a:font script="Osma" typeface="Ebrima"/>
-        <a:font script="Phag" typeface="Phagspa"/>
-        <a:font script="Syrn" typeface="Estrangelo Edessa"/>
-        <a:font script="Syrj" typeface="Estrangelo Edessa"/>
-        <a:font script="Syre" typeface="Estrangelo Edessa"/>
-        <a:font script="Sora" typeface="Nirmala UI"/>
-        <a:font script="Tale" typeface="Microsoft Tai Le"/>
-        <a:font script="Talu" typeface="Microsoft New Tai Lue"/>
-        <a:font script="Tfng" typeface="Ebrima"/>
       </a:minorFont>
     </a:fontScheme>
     <a:fmtScheme name="Office">
@@ -1103,6 +1064,13 @@
         </a:gradFill>
       </a:fillStyleLst>
       <a:lnStyleLst>
+        <a:ln w="6350" cap="flat" cmpd="sng" algn="ctr">
+          <a:solidFill>
+            <a:schemeClr val="phClr"/>
+          </a:solidFill>
+          <a:prstDash val="solid"/>
+          <a:miter lim="800000"/>
+        </a:ln>
         <a:ln w="12700" cap="flat" cmpd="sng" algn="ctr">
           <a:solidFill>
             <a:schemeClr val="phClr"/>
@@ -1111,13 +1079,6 @@
           <a:miter lim="800000"/>
         </a:ln>
         <a:ln w="19050" cap="flat" cmpd="sng" algn="ctr">
-          <a:solidFill>
-            <a:schemeClr val="phClr"/>
-          </a:solidFill>
-          <a:prstDash val="solid"/>
-          <a:miter lim="800000"/>
-        </a:ln>
-        <a:ln w="25400" cap="flat" cmpd="sng" algn="ctr">
           <a:solidFill>
             <a:schemeClr val="phClr"/>
           </a:solidFill>
@@ -1182,31 +1143,11 @@
       </a:bgFillStyleLst>
     </a:fmtScheme>
   </a:themeElements>
-  <a:objectDefaults>
-    <a:lnDef>
-      <a:spPr/>
-      <a:bodyPr/>
-      <a:lstStyle/>
-      <a:style>
-        <a:lnRef idx="2">
-          <a:schemeClr val="accent1"/>
-        </a:lnRef>
-        <a:fillRef idx="0">
-          <a:schemeClr val="accent1"/>
-        </a:fillRef>
-        <a:effectRef idx="1">
-          <a:schemeClr val="accent1"/>
-        </a:effectRef>
-        <a:fontRef idx="minor">
-          <a:schemeClr val="tx1"/>
-        </a:fontRef>
-      </a:style>
-    </a:lnDef>
-  </a:objectDefaults>
+  <a:objectDefaults/>
   <a:extraClrSchemeLst/>
   <a:extLst>
     <a:ext uri="{05A4C25C-085E-4340-85A3-A5531E510DB2}">
-      <thm15:themeFamily xmlns:thm15="http://schemas.microsoft.com/office/thememl/2012/main" name="Office Theme" id="{2E142A2C-CD16-42D6-873A-C26D2A0506FA}" vid="{1BDDFF52-6CD6-40A5-AB3C-68EB2F1E4D0A}"/>
+      <thm15:themeFamily xmlns:thm15="http://schemas.microsoft.com/office/thememl/2012/main" name="Office Theme" id="{62F939B6-93AF-4DB8-9C6B-D6C7DFDC589F}" vid="{4A3C46E8-61CC-4603-A589-7422A47A8E4A}"/>
     </a:ext>
   </a:extLst>
 </a:theme>

</xml_diff>

<commit_message>
Strip the house look from the bundled reference, keeping Centered and the empty header/footer; drop the stair-step heading numbering indent
</commit_message>
<xml_diff>
--- a/mdhtml2docx/templates/reference.docx
+++ b/mdhtml2docx/templates/reference.docx
@@ -21,15 +21,70 @@
 
 <file path=word/footer.xml><?xml version="1.0" encoding="utf-8"?>
 <w:ftr xmlns:w14="http://schemas.microsoft.com/office/word/2010/wordml" xmlns:w="http://schemas.openxmlformats.org/wordprocessingml/2006/main">
+  <w:tbl>
+    <w:tblPr>
+      <w:tblStyle w:val="TableNormal"/>
+      <w:bidiVisual w:val="0"/>
+      <w:tblW w:w="0" w:type="auto"/>
+      <w:tblLook w:val="06A0" w:firstRow="1" w:lastRow="0" w:firstColumn="1" w:lastColumn="0" w:noHBand="1" w:noVBand="1"/>
+    </w:tblPr>
+    <w:tblGrid>
+      <w:gridCol w:w="3120"/>
+      <w:gridCol w:w="3120"/>
+      <w:gridCol w:w="3120"/>
+    </w:tblGrid>
+    <w:tr>
+      <w:trPr>
+        <w:trHeight w:val="300"/>
+      </w:trPr>
+      <w:tc>
+        <w:tcPr>
+          <w:tcW w:w="3120" w:type="dxa"/>
+          <w:tcMar/>
+        </w:tcPr>
+        <w:p>
+          <w:pPr>
+            <w:pStyle w:val="Header"/>
+            <w:bidi w:val="0"/>
+            <w:ind w:left="-115"/>
+            <w:jc w:val="left"/>
+          </w:pPr>
+        </w:p>
+      </w:tc>
+      <w:tc>
+        <w:tcPr>
+          <w:tcW w:w="3120" w:type="dxa"/>
+          <w:tcMar/>
+        </w:tcPr>
+        <w:p>
+          <w:pPr>
+            <w:pStyle w:val="Header"/>
+            <w:bidi w:val="0"/>
+            <w:jc w:val="center"/>
+          </w:pPr>
+        </w:p>
+      </w:tc>
+      <w:tc>
+        <w:tcPr>
+          <w:tcW w:w="3120" w:type="dxa"/>
+          <w:tcMar/>
+        </w:tcPr>
+        <w:p>
+          <w:pPr>
+            <w:pStyle w:val="Header"/>
+            <w:bidi w:val="0"/>
+            <w:ind w:right="-115"/>
+            <w:jc w:val="right"/>
+          </w:pPr>
+        </w:p>
+      </w:tc>
+    </w:tr>
+  </w:tbl>
   <w:p>
     <w:pPr>
-      <w:jc w:val="center"/>
-    </w:pPr>
-    <w:fldSimple w:instr=" PAGE ">
-      <w:r>
-        <w:t>1</w:t>
-      </w:r>
-    </w:fldSimple>
+      <w:pStyle w:val="Footer"/>
+      <w:bidi w:val="0"/>
+    </w:pPr>
   </w:p>
 </w:ftr>
 </file>
@@ -109,10 +164,10 @@
   <w:docDefaults>
     <w:rPrDefault>
       <w:rPr>
-        <w:rFonts w:ascii="Times New Roman" w:hAnsi="Times New Roman" w:eastAsia="Times New Roman" w:cs="Times New Roman"/>
-        <w:sz w:val="22"/>
-        <w:szCs w:val="22"/>
-        <w:lang w:val="en-US"/>
+        <w:rFonts w:asciiTheme="minorHAnsi" w:hAnsiTheme="minorHAnsi" w:eastAsiaTheme="minorEastAsia" w:cstheme="minorBidi"/>
+        <w:sz w:val="24"/>
+        <w:szCs w:val="24"/>
+        <w:lang w:val="en-US" w:eastAsia="ja-JP" w:bidi="ar-SA"/>
       </w:rPr>
     </w:rPrDefault>
     <w:pPrDefault>
@@ -497,11 +552,6 @@
   <w:style w:type="paragraph" w:styleId="Normal" w:default="1">
     <w:name w:val="Normal"/>
     <w:qFormat/>
-    <w:pPr>
-      <w:spacing w:line="360" w:lineRule="auto" w:after="220"/>
-      <w:ind w:firstLine="0"/>
-      <w:jc w:val="both"/>
-    </w:pPr>
   </w:style>
   <w:style w:type="character" w:styleId="DefaultParagraphFont" w:default="1">
     <w:name w:val="Default Paragraph Font"/>
@@ -582,18 +632,18 @@
     <w:next w:val="FirstParagraph"/>
     <w:qFormat/>
     <w:rsid w:val="4425367B"/>
-    <w:pPr>
-      <w:spacing w:line="360" w:lineRule="auto" w:after="220"/>
-      <w:jc w:val="both"/>
+    <w:rPr>
+      <w:rFonts w:ascii="Aptos Display" w:hAnsi="Aptos Display" w:eastAsia="" w:cs="" w:asciiTheme="majorAscii" w:hAnsiTheme="majorAscii" w:eastAsiaTheme="majorEastAsia" w:cstheme="majorBidi"/>
+      <w:color w:val="0F4761" w:themeColor="accent1" w:themeTint="FF" w:themeShade="BF"/>
+      <w:sz w:val="40"/>
+      <w:szCs w:val="40"/>
+    </w:rPr>
+    <w:pPr>
+      <w:keepNext w:val="1"/>
+      <w:keepLines w:val="1"/>
+      <w:spacing w:before="360" w:after="80"/>
       <w:outlineLvl w:val="0"/>
     </w:pPr>
-    <w:rPr>
-      <w:rFonts w:ascii="Times New Roman" w:hAnsi="Times New Roman" w:eastAsia="Times New Roman" w:cs="Times New Roman"/>
-      <w:b/>
-      <w:color w:val="auto"/>
-      <w:sz w:val="22"/>
-      <w:szCs w:val="22"/>
-    </w:rPr>
   </w:style>
   <w:style w:type="paragraph" w:styleId="ListParagraph">
     <w:uiPriority w:val="34"/>
@@ -615,18 +665,18 @@
     <w:unhideWhenUsed/>
     <w:qFormat/>
     <w:rsid w:val="4425367B"/>
-    <w:pPr>
-      <w:spacing w:line="360" w:lineRule="auto" w:after="220"/>
-      <w:jc w:val="both"/>
+    <w:rPr>
+      <w:rFonts w:ascii="Aptos Display" w:hAnsi="Aptos Display" w:eastAsia="" w:cs="" w:asciiTheme="majorAscii" w:hAnsiTheme="majorAscii" w:eastAsiaTheme="majorEastAsia" w:cstheme="majorBidi"/>
+      <w:color w:val="0F4761" w:themeColor="accent1" w:themeTint="FF" w:themeShade="BF"/>
+      <w:sz w:val="32"/>
+      <w:szCs w:val="32"/>
+    </w:rPr>
+    <w:pPr>
+      <w:keepNext w:val="1"/>
+      <w:keepLines w:val="1"/>
+      <w:spacing w:before="160" w:after="80"/>
       <w:outlineLvl w:val="1"/>
     </w:pPr>
-    <w:rPr>
-      <w:rFonts w:ascii="Times New Roman" w:hAnsi="Times New Roman" w:eastAsia="Times New Roman" w:cs="Times New Roman"/>
-      <w:b/>
-      <w:color w:val="auto"/>
-      <w:sz w:val="22"/>
-      <w:szCs w:val="22"/>
-    </w:rPr>
   </w:style>
   <w:style w:type="paragraph" w:styleId="Heading3">
     <w:uiPriority w:val="9"/>
@@ -636,18 +686,18 @@
     <w:unhideWhenUsed/>
     <w:qFormat/>
     <w:rsid w:val="4425367B"/>
-    <w:pPr>
-      <w:spacing w:line="360" w:lineRule="auto" w:after="220"/>
-      <w:jc w:val="both"/>
+    <w:rPr>
+      <w:rFonts w:eastAsia="" w:cs="" w:eastAsiaTheme="majorEastAsia" w:cstheme="majorBidi"/>
+      <w:color w:val="0F4761" w:themeColor="accent1" w:themeTint="FF" w:themeShade="BF"/>
+      <w:sz w:val="28"/>
+      <w:szCs w:val="28"/>
+    </w:rPr>
+    <w:pPr>
+      <w:keepNext w:val="1"/>
+      <w:keepLines w:val="1"/>
+      <w:spacing w:before="160" w:after="80"/>
       <w:outlineLvl w:val="2"/>
     </w:pPr>
-    <w:rPr>
-      <w:rFonts w:ascii="Times New Roman" w:hAnsi="Times New Roman" w:eastAsia="Times New Roman" w:cs="Times New Roman"/>
-      <w:b/>
-      <w:color w:val="auto"/>
-      <w:sz w:val="22"/>
-      <w:szCs w:val="22"/>
-    </w:rPr>
   </w:style>
   <w:style w:type="paragraph" w:styleId="Heading4">
     <w:uiPriority w:val="9"/>
@@ -657,18 +707,18 @@
     <w:unhideWhenUsed/>
     <w:qFormat/>
     <w:rsid w:val="4425367B"/>
-    <w:pPr>
-      <w:spacing w:line="360" w:lineRule="auto" w:after="220"/>
-      <w:jc w:val="both"/>
+    <w:rPr>
+      <w:rFonts w:eastAsia="" w:cs="" w:eastAsiaTheme="majorEastAsia" w:cstheme="majorBidi"/>
+      <w:i w:val="1"/>
+      <w:iCs w:val="1"/>
+      <w:color w:val="0F4761" w:themeColor="accent1" w:themeTint="FF" w:themeShade="BF"/>
+    </w:rPr>
+    <w:pPr>
+      <w:keepNext w:val="1"/>
+      <w:keepLines w:val="1"/>
+      <w:spacing w:before="80" w:after="40"/>
       <w:outlineLvl w:val="3"/>
     </w:pPr>
-    <w:rPr>
-      <w:rFonts w:ascii="Times New Roman" w:hAnsi="Times New Roman" w:eastAsia="Times New Roman" w:cs="Times New Roman"/>
-      <w:b/>
-      <w:color w:val="auto"/>
-      <w:sz w:val="22"/>
-      <w:szCs w:val="22"/>
-    </w:rPr>
   </w:style>
   <w:style w:type="paragraph" w:styleId="Heading5">
     <w:uiPriority w:val="9"/>
@@ -678,18 +728,16 @@
     <w:unhideWhenUsed/>
     <w:qFormat/>
     <w:rsid w:val="4425367B"/>
-    <w:pPr>
-      <w:spacing w:line="360" w:lineRule="auto" w:after="220"/>
-      <w:jc w:val="both"/>
+    <w:rPr>
+      <w:rFonts w:eastAsia="" w:cs="" w:eastAsiaTheme="majorEastAsia" w:cstheme="majorBidi"/>
+      <w:color w:val="0F4761" w:themeColor="accent1" w:themeTint="FF" w:themeShade="BF"/>
+    </w:rPr>
+    <w:pPr>
+      <w:keepNext w:val="1"/>
+      <w:keepLines w:val="1"/>
+      <w:spacing w:before="80" w:after="40"/>
       <w:outlineLvl w:val="4"/>
     </w:pPr>
-    <w:rPr>
-      <w:rFonts w:ascii="Times New Roman" w:hAnsi="Times New Roman" w:eastAsia="Times New Roman" w:cs="Times New Roman"/>
-      <w:b/>
-      <w:color w:val="auto"/>
-      <w:sz w:val="22"/>
-      <w:szCs w:val="22"/>
-    </w:rPr>
   </w:style>
   <w:style w:type="paragraph" w:styleId="Heading6">
     <w:uiPriority w:val="9"/>
@@ -699,18 +747,18 @@
     <w:unhideWhenUsed/>
     <w:qFormat/>
     <w:rsid w:val="4425367B"/>
-    <w:pPr>
-      <w:spacing w:line="360" w:lineRule="auto" w:after="220"/>
-      <w:jc w:val="both"/>
+    <w:rPr>
+      <w:rFonts w:eastAsia="" w:cs="" w:eastAsiaTheme="majorEastAsia" w:cstheme="majorBidi"/>
+      <w:i w:val="1"/>
+      <w:iCs w:val="1"/>
+      <w:color w:val="595959" w:themeColor="text1" w:themeTint="A6" w:themeShade="FF"/>
+    </w:rPr>
+    <w:pPr>
+      <w:keepNext w:val="1"/>
+      <w:keepLines w:val="1"/>
+      <w:spacing w:before="40" w:after="0"/>
       <w:outlineLvl w:val="5"/>
     </w:pPr>
-    <w:rPr>
-      <w:rFonts w:ascii="Times New Roman" w:hAnsi="Times New Roman" w:eastAsia="Times New Roman" w:cs="Times New Roman"/>
-      <w:b/>
-      <w:color w:val="auto"/>
-      <w:sz w:val="22"/>
-      <w:szCs w:val="22"/>
-    </w:rPr>
   </w:style>
   <w:style w:type="paragraph" w:styleId="Title">
     <w:uiPriority w:val="10"/>
@@ -719,13 +767,15 @@
     <w:next w:val="FirstParagraph"/>
     <w:qFormat/>
     <w:rsid w:val="4425367B"/>
-    <w:pPr>
-      <w:jc w:val="center"/>
-    </w:pPr>
-    <w:rPr>
-      <w:sz w:val="28"/>
-      <w:szCs w:val="28"/>
-    </w:rPr>
+    <w:rPr>
+      <w:rFonts w:ascii="Aptos Display" w:hAnsi="Aptos Display" w:eastAsia="" w:cs="" w:asciiTheme="majorAscii" w:hAnsiTheme="majorAscii" w:eastAsiaTheme="majorEastAsia" w:cstheme="majorBidi"/>
+      <w:sz w:val="56"/>
+      <w:szCs w:val="56"/>
+    </w:rPr>
+    <w:pPr>
+      <w:spacing w:after="80" w:line="240" w:lineRule="auto"/>
+      <w:contextualSpacing/>
+    </w:pPr>
   </w:style>
   <w:style w:type="paragraph" w:styleId="BodyText">
     <w:name w:val="Body Text"/>

</xml_diff>